<commit_message>
Keep only Modern Navy CV with referee and left signature
Add Firminus Mugumya as referee, left-align the signing block, and remove the other CV designs and brief versions.

Co-authored-by: Cursor <cursoragent@cursor.com>
</commit_message>
<xml_diff>
--- a/racheal_cv/detailed_versions/racheal_nabukeera_modern_navy_word.docx
+++ b/racheal_cv/detailed_versions/racheal_nabukeera_modern_navy_word.docx
@@ -3030,8 +3030,143 @@
     </w:p>
     <w:p>
       <w:pPr>
+        <w:spacing w:before="200" w:after="100"/>
+        <w:shd w:fill="0B2942"/>
+      </w:pPr>
+      <w:r>
+        <w:rPr>
+          <w:rFonts w:ascii="Arial" w:hAnsi="Arial" w:eastAsia="Arial"/>
+          <w:b/>
+          <w:color w:val="FFFFFF"/>
+          <w:sz w:val="21"/>
+        </w:rPr>
+        <w:t>REFEREES</w:t>
+      </w:r>
+    </w:p>
+    <w:p>
+      <w:pPr>
+        <w:spacing w:after="100" w:line="259" w:lineRule="auto"/>
+        <w:jc w:val="both"/>
+      </w:pPr>
+      <w:r>
+        <w:rPr>
+          <w:rFonts w:ascii="Arial" w:hAnsi="Arial" w:eastAsia="Arial"/>
+          <w:b w:val="0"/>
+          <w:color w:val="25313D"/>
+          <w:sz w:val="19"/>
+        </w:rPr>
+        <w:t>Firminus Mugumya, PhD</w:t>
+      </w:r>
+    </w:p>
+    <w:p>
+      <w:pPr>
+        <w:spacing w:after="100" w:line="259" w:lineRule="auto"/>
+        <w:jc w:val="both"/>
+      </w:pPr>
+      <w:r>
+        <w:rPr>
+          <w:rFonts w:ascii="Arial" w:hAnsi="Arial" w:eastAsia="Arial"/>
+          <w:b w:val="0"/>
+          <w:color w:val="25313D"/>
+          <w:sz w:val="19"/>
+        </w:rPr>
+        <w:t>Assoc. Professor of Developmental Social Work (Community Systems Governance)</w:t>
+      </w:r>
+    </w:p>
+    <w:p>
+      <w:pPr>
+        <w:spacing w:after="100" w:line="259" w:lineRule="auto"/>
+        <w:jc w:val="both"/>
+      </w:pPr>
+      <w:r>
+        <w:rPr>
+          <w:rFonts w:ascii="Arial" w:hAnsi="Arial" w:eastAsia="Arial"/>
+          <w:b w:val="0"/>
+          <w:color w:val="25313D"/>
+          <w:sz w:val="19"/>
+        </w:rPr>
+        <w:t>Dept. of Social Work &amp; Social Administration</w:t>
+      </w:r>
+    </w:p>
+    <w:p>
+      <w:pPr>
+        <w:spacing w:after="100" w:line="259" w:lineRule="auto"/>
+        <w:jc w:val="both"/>
+      </w:pPr>
+      <w:r>
+        <w:rPr>
+          <w:rFonts w:ascii="Arial" w:hAnsi="Arial" w:eastAsia="Arial"/>
+          <w:b w:val="0"/>
+          <w:color w:val="25313D"/>
+          <w:sz w:val="19"/>
+        </w:rPr>
+        <w:t>School of Social Sciences</w:t>
+      </w:r>
+    </w:p>
+    <w:p>
+      <w:pPr>
+        <w:spacing w:after="100" w:line="259" w:lineRule="auto"/>
+        <w:jc w:val="both"/>
+      </w:pPr>
+      <w:r>
+        <w:rPr>
+          <w:rFonts w:ascii="Arial" w:hAnsi="Arial" w:eastAsia="Arial"/>
+          <w:b w:val="0"/>
+          <w:color w:val="25313D"/>
+          <w:sz w:val="19"/>
+        </w:rPr>
+        <w:t>College of Humanities and Social Sciences (CHUSS)</w:t>
+      </w:r>
+    </w:p>
+    <w:p>
+      <w:pPr>
+        <w:spacing w:after="100" w:line="259" w:lineRule="auto"/>
+        <w:jc w:val="both"/>
+      </w:pPr>
+      <w:r>
+        <w:rPr>
+          <w:rFonts w:ascii="Arial" w:hAnsi="Arial" w:eastAsia="Arial"/>
+          <w:b w:val="0"/>
+          <w:color w:val="25313D"/>
+          <w:sz w:val="19"/>
+        </w:rPr>
+        <w:t>Makerere University, Kampala</w:t>
+      </w:r>
+    </w:p>
+    <w:p>
+      <w:pPr>
+        <w:spacing w:after="100" w:line="259" w:lineRule="auto"/>
+        <w:jc w:val="both"/>
+      </w:pPr>
+      <w:r>
+        <w:rPr>
+          <w:rFonts w:ascii="Arial" w:hAnsi="Arial" w:eastAsia="Arial"/>
+          <w:b w:val="0"/>
+          <w:color w:val="25313D"/>
+          <w:sz w:val="19"/>
+        </w:rPr>
+        <w:t>Email: firminus.mugumya@mak.ac.ug | mugufirm@gmail.com | firmlib@yahoo.co.uk</w:t>
+      </w:r>
+    </w:p>
+    <w:p>
+      <w:pPr>
+        <w:spacing w:after="100" w:line="259" w:lineRule="auto"/>
+        <w:jc w:val="both"/>
+      </w:pPr>
+      <w:r>
+        <w:rPr>
+          <w:rFonts w:ascii="Arial" w:hAnsi="Arial" w:eastAsia="Arial"/>
+          <w:b w:val="0"/>
+          <w:color w:val="25313D"/>
+          <w:sz w:val="19"/>
+        </w:rPr>
+        <w:t>Mobile: +256 782 351 444</w:t>
+      </w:r>
+    </w:p>
+    <w:p>
+      <w:pPr>
         <w:spacing w:before="200" w:after="20"/>
-        <w:jc w:val="right"/>
+        <w:jc w:val="left"/>
       </w:pPr>
       <w:r>
         <w:rPr>
@@ -3046,7 +3181,7 @@
     <w:p>
       <w:pPr>
         <w:spacing w:after="20"/>
-        <w:jc w:val="right"/>
+        <w:jc w:val="left"/>
       </w:pPr>
       <w:r>
         <w:drawing>
@@ -3086,7 +3221,7 @@
     <w:p>
       <w:pPr>
         <w:spacing w:after="0"/>
-        <w:jc w:val="right"/>
+        <w:jc w:val="left"/>
       </w:pPr>
       <w:r>
         <w:rPr>

</xml_diff>

<commit_message>
Add three referees to the Modern Navy CV
Include Mugumya, Kitayimbwa, and Aliku contact details from the provided sources and keep the CV on five pages.

Co-authored-by: Cursor <cursoragent@cursor.com>
</commit_message>
<xml_diff>
--- a/racheal_cv/detailed_versions/racheal_nabukeera_modern_navy_word.docx
+++ b/racheal_cv/detailed_versions/racheal_nabukeera_modern_navy_word.docx
@@ -3055,7 +3055,7 @@
           <w:color w:val="25313D"/>
           <w:sz w:val="19"/>
         </w:rPr>
-        <w:t>Firminus Mugumya, PhD</w:t>
+        <w:t>Firminus Mugumya, PhD - Assoc. Professor of Developmental Social Work (Community Systems Governance), Dept. of Social Work &amp; Social Administration, School of Social Sciences, College of Humanities and Social Sciences (CHUSS), Makerere University, Kampala. Email: firminus.mugumya@mak.ac.ug | mugufirm@gmail.com | firmlib@yahoo.co.uk. Mobile: +256 782 351 444.</w:t>
       </w:r>
     </w:p>
     <w:p>
@@ -3070,7 +3070,7 @@
           <w:color w:val="25313D"/>
           <w:sz w:val="19"/>
         </w:rPr>
-        <w:t>Assoc. Professor of Developmental Social Work (Community Systems Governance)</w:t>
+        <w:t>Rev. Prof. John Mulindwa Kitayimbwa - Deputy Vice-Chancellor (Academic Affairs), Uganda Christian University. Email: Jkitayimbwa@ucu.ac.ug. Mobile: +256 701 962511.</w:t>
       </w:r>
     </w:p>
     <w:p>
@@ -3085,82 +3085,7 @@
           <w:color w:val="25313D"/>
           <w:sz w:val="19"/>
         </w:rPr>
-        <w:t>Dept. of Social Work &amp; Social Administration</w:t>
-      </w:r>
-    </w:p>
-    <w:p>
-      <w:pPr>
-        <w:spacing w:after="100" w:line="259" w:lineRule="auto"/>
-        <w:jc w:val="both"/>
-      </w:pPr>
-      <w:r>
-        <w:rPr>
-          <w:rFonts w:ascii="Arial" w:hAnsi="Arial" w:eastAsia="Arial"/>
-          <w:b w:val="0"/>
-          <w:color w:val="25313D"/>
-          <w:sz w:val="19"/>
-        </w:rPr>
-        <w:t>School of Social Sciences</w:t>
-      </w:r>
-    </w:p>
-    <w:p>
-      <w:pPr>
-        <w:spacing w:after="100" w:line="259" w:lineRule="auto"/>
-        <w:jc w:val="both"/>
-      </w:pPr>
-      <w:r>
-        <w:rPr>
-          <w:rFonts w:ascii="Arial" w:hAnsi="Arial" w:eastAsia="Arial"/>
-          <w:b w:val="0"/>
-          <w:color w:val="25313D"/>
-          <w:sz w:val="19"/>
-        </w:rPr>
-        <w:t>College of Humanities and Social Sciences (CHUSS)</w:t>
-      </w:r>
-    </w:p>
-    <w:p>
-      <w:pPr>
-        <w:spacing w:after="100" w:line="259" w:lineRule="auto"/>
-        <w:jc w:val="both"/>
-      </w:pPr>
-      <w:r>
-        <w:rPr>
-          <w:rFonts w:ascii="Arial" w:hAnsi="Arial" w:eastAsia="Arial"/>
-          <w:b w:val="0"/>
-          <w:color w:val="25313D"/>
-          <w:sz w:val="19"/>
-        </w:rPr>
-        <w:t>Makerere University, Kampala</w:t>
-      </w:r>
-    </w:p>
-    <w:p>
-      <w:pPr>
-        <w:spacing w:after="100" w:line="259" w:lineRule="auto"/>
-        <w:jc w:val="both"/>
-      </w:pPr>
-      <w:r>
-        <w:rPr>
-          <w:rFonts w:ascii="Arial" w:hAnsi="Arial" w:eastAsia="Arial"/>
-          <w:b w:val="0"/>
-          <w:color w:val="25313D"/>
-          <w:sz w:val="19"/>
-        </w:rPr>
-        <w:t>Email: firminus.mugumya@mak.ac.ug | mugufirm@gmail.com | firmlib@yahoo.co.uk</w:t>
-      </w:r>
-    </w:p>
-    <w:p>
-      <w:pPr>
-        <w:spacing w:after="100" w:line="259" w:lineRule="auto"/>
-        <w:jc w:val="both"/>
-      </w:pPr>
-      <w:r>
-        <w:rPr>
-          <w:rFonts w:ascii="Arial" w:hAnsi="Arial" w:eastAsia="Arial"/>
-          <w:b w:val="0"/>
-          <w:color w:val="25313D"/>
-          <w:sz w:val="19"/>
-        </w:rPr>
-        <w:t>Mobile: +256 782 351 444</w:t>
+        <w:t>Dr. Twalib Aliku - Senior Consultant Paediatrician/Cardiologist, FairBanks Medical Centre, Kyebando - Kisalosala, P.O. Box 111907, Kampala, Uganda. Email: info@fairbanksmedicalcentre.com. Mobile: +256 751 207566 | +256 777 462398.</w:t>
       </w:r>
     </w:p>
     <w:p>

</xml_diff>